<commit_message>
docs: refresh implementation report (Redis live, Jira anchor fix, Bolt section, test counts)
Redis multi-replica is now the live prod config, not "implemented unused";
proxy-first section covers the Jira X-Jira-Base-Url anchor override and
15MB response cap (audit H4/M8); new 2.6 Bolt tracking subsection covers
the feature shipped after this report was first written; backend test
count updated 1,365 -> 1,374.
</commit_message>
<xml_diff>
--- a/docs/framework/Apex-Implementation-Report.docx
+++ b/docs/framework/Apex-Implementation-Report.docx
@@ -127,7 +127,7 @@
           <w:b w:val="0"/>
           <w:i w:val="0"/>
         </w:rPr>
-        <w:t>That precondition exists and is implemented, unused by default: src/distributed.py adds an optional Redis-backed coordination layer (Upstash's free tier over TLS). When REDIS_URL is unset, every primitive falls back to the process-local equivalent and behavior is byte-for-byte identical to the single-replica deployment. When set, the same lock names and the rate-limit counters become coherent across replicas, which is the actual precondition for safely raising max-replicas above 1. The module was built and Redis-enabled mode is covered by the test suite (via fakeredis + lupa for the Lua-scripted atomic operations) but production currently runs with REDIS_URL unset — single-replica is still the live configuration.</w:t>
+        <w:t>That precondition exists and is implemented, and is now the live production configuration: src/distributed.py adds an optional Redis-backed coordination layer (Upstash's free tier over TLS). When REDIS_URL is unset, every primitive falls back to the process-local equivalent and behavior is byte-for-byte identical to the single-replica deployment. As of 2026-06-21, REDIS_URL is set in production (Upstash rediss://), max-replicas raised to 3, and the deployment was verified by inspecting live client connections (CLIENT LIST) from the expected Azure IPs. The module was built and Redis-enabled mode is covered by the test suite (via fakeredis + lupa for the Lua-scripted atomic operations); the single-replica fallback described above remains correct and unchanged for anyone running REDIS_URL unset.</w:t>
       </w:r>
     </w:p>
     <w:p>
@@ -144,7 +144,7 @@
           <w:b w:val="0"/>
           <w:i w:val="0"/>
         </w:rPr>
-        <w:t>Every outbound call to a user-configurable host — Taiga, Jira, Figma — is proxied server-side rather than called directly from the browser, specifically to close SSRF: the proxy validates the target host (must be https://, must resolve to a non-private IP) before forwarding. GitHub is the deliberate exception for most operations (browser-direct, since GitHub allows * CORS and the PAT never touches the backend for those calls) except for two cases that need server-side execution regardless of CORS: syncing github-context.md (a shallow git clone + the repomix CLI packs the repo into Markdown context — genuinely needs a server-side filesystem and a real git binary) and Phase 5's GitHub Actions workflow dispatch (needs the server-held PAT, not a browser-supplied one).</w:t>
+        <w:t>Every outbound call to a user-configurable host — Taiga, Jira, Figma — is proxied server-side rather than called directly from the browser, specifically to close SSRF: the proxy validates the target host (must be https://, must resolve to a non-private IP) before forwarding. Both Taiga and Jira accept a per-request identity-anchor override (X-Taiga-Url / X-Jira-Base-Url) so a client-supplied host, not just the shared stored config, is what gets validated and used to derive instance_id — this closes a gap where any PM-authenticated user flipping the shared jira_base_url could have misrouted another user's identity/project checks (audit item H4). Both proxies also cap forwarded response bodies at 15MB (pm_http.check_response_size, MAX_RESPONSE_BYTES) and return 502 rather than relaying an oversized body (audit item M8). GitHub is the deliberate exception for most operations (browser-direct, since GitHub allows * CORS and the PAT never touches the backend for those calls) except for two cases that need server-side execution regardless of CORS: syncing github-context.md (a shallow git clone + the repomix CLI packs the repo into Markdown context — genuinely needs a server-side filesystem and a real git binary) and Phase 5's GitHub Actions workflow dispatch (needs the server-held PAT, not a browser-supplied one).</w:t>
       </w:r>
     </w:p>
     <w:p>
@@ -166,6 +166,23 @@
     </w:p>
     <w:p>
       <w:pPr>
+        <w:pStyle w:val="Heading2"/>
+      </w:pPr>
+      <w:r>
+        <w:t>2.6 Bolt tracking</w:t>
+      </w:r>
+    </w:p>
+    <w:p>
+      <w:pPr/>
+      <w:r>
+        <w:rPr>
+          <w:b w:val="0"/>
+        </w:rPr>
+        <w:t>Bolt tracking is a per-task implementation micro-cycle layered on top of Phase 3, independent of a story's own phase_status: each task carries a bolts dict recording pack_ready -&gt; pushed -&gt; done transitions and their timestamps (context_manager.record_task_bolt_status), with pack_ready set automatically when a developer pack is generated. bolt_cycle_hours computes pack_ready-to-done elapsed time from that history; the same helper backs both the single-task status route and list_all_bolts, which aggregates every task's Bolt row across the whole story index for the dedicated /bolts board page. Per-project label text and a cycle-time threshold are user-configurable (.bolt-config.json, mirroring the existing deployment-config persistence pattern) rather than hardcoded, and a median/p90 Bolt Cycle Time card surfaces the same metric in Analytics.</w:t>
+      </w:r>
+    </w:p>
+    <w:p>
+      <w:pPr>
         <w:pStyle w:val="Heading1"/>
       </w:pPr>
       <w:r>
@@ -179,6 +196,9 @@
           <w:i w:val="0"/>
         </w:rPr>
         <w:t>Testing is layered by what each layer can actually catch, not run as one undifferentiated suite:</w:t>
+      </w:r>
+      <w:r>
+        <w:t xml:space="preserve"> Coverage spans workflow logic, security boundaries, and product-specific state machines such as Bolt lifecycle tracking (§2.6) and its list/config/cycle-time-aggregation routes.</w:t>
       </w:r>
     </w:p>
     <w:p>
@@ -195,7 +215,7 @@
           <w:b w:val="0"/>
           <w:i w:val="0"/>
         </w:rPr>
-        <w:t>1,365 tests as of this writing (python -m pytest tests/ -v --tb=short), gated in CI before any Docker build is even attempted. Six autouse fixtures in tests/conftest.py remove entire categories of flaky-test risk by construction rather than by convention:</w:t>
+        <w:t>1,374 tests as of this writing (python -m pytest tests/ -v --tb=short), gated in CI before any Docker build is even attempted. Six autouse fixtures in tests/conftest.py remove entire categories of flaky-test risk by construction rather than by convention:</w:t>
       </w:r>
     </w:p>
     <w:p>
@@ -455,7 +475,7 @@
         <w:pStyle w:val="ListBullet"/>
       </w:pPr>
       <w:r>
-        <w:t>Numbers in this document (1,365 backend tests, 180 frontend tests, 17 E2E specs) are a snapshot as of this writing and will drift as the codebase grows — re-run the counts (§1) rather than citing this document as the current figure without checking.</w:t>
+        <w:t>Numbers in this document (1,374 backend tests, 180 frontend tests, 17 E2E specs) are a snapshot as of this writing and will drift as the codebase grows — re-run the counts (§1) rather than citing this document as the current figure without checking.</w:t>
       </w:r>
     </w:p>
     <w:p>

</xml_diff>

<commit_message>
docs: sync backend test count to 1,380 across implementation report
</commit_message>
<xml_diff>
--- a/docs/framework/Apex-Implementation-Report.docx
+++ b/docs/framework/Apex-Implementation-Report.docx
@@ -49,7 +49,7 @@
           <w:b w:val="0"/>
           <w:i w:val="0"/>
         </w:rPr>
-        <w:t>Interview feedback on Apex's academic presentation asked for real engineering documentation — implementation, testing, and deployment — beyond the product-facing README. This document is that record. It describes Apex as of this writing: a split-stack web application with 1,365 backend tests, 180 frontend unit tests, 17 end-to-end specs, and a five-stage CI/CD pipeline deploying to Azure Container Apps. Numbers and file paths in this document are a snapshot — the codebase continues to evolve, and specific counts should be re-verified rather than assumed to still hold if this document is read much later than it was written.</w:t>
+        <w:t>Interview feedback on Apex's academic presentation asked for real engineering documentation — implementation, testing, and deployment — beyond the product-facing README. This document is that record. It describes Apex as of this writing: a split-stack web application with 1,380 backend tests, 180 frontend unit tests, 17 end-to-end specs, and a five-stage CI/CD pipeline deploying to Azure Container Apps. Numbers and file paths in this document are a snapshot — the codebase continues to evolve, and specific counts should be re-verified rather than assumed to still hold if this document is read much later than it was written.</w:t>
       </w:r>
     </w:p>
     <w:p>
@@ -215,7 +215,7 @@
           <w:b w:val="0"/>
           <w:i w:val="0"/>
         </w:rPr>
-        <w:t>1,374 tests as of this writing (python -m pytest tests/ -v --tb=short), gated in CI before any Docker build is even attempted. Six autouse fixtures in tests/conftest.py remove entire categories of flaky-test risk by construction rather than by convention:</w:t>
+        <w:t>1,380 tests as of this writing (python -m pytest tests/ -v --tb=short), gated in CI before any Docker build is even attempted. Six autouse fixtures in tests/conftest.py remove entire categories of flaky-test risk by construction rather than by convention:</w:t>
       </w:r>
     </w:p>
     <w:p>
@@ -475,7 +475,7 @@
         <w:pStyle w:val="ListBullet"/>
       </w:pPr>
       <w:r>
-        <w:t>Numbers in this document (1,374 backend tests, 180 frontend tests, 17 E2E specs) are a snapshot as of this writing and will drift as the codebase grows — re-run the counts (§1) rather than citing this document as the current figure without checking.</w:t>
+        <w:t>Numbers in this document (1,380 backend tests, 180 frontend tests, 17 E2E specs) are a snapshot as of this writing and will drift as the codebase grows — re-run the counts (§1) rather than citing this document as the current figure without checking.</w:t>
       </w:r>
     </w:p>
     <w:p>

</xml_diff>

<commit_message>
docs: add architecture and user-flow diagrams to implementation report
</commit_message>
<xml_diff>
--- a/docs/framework/Apex-Implementation-Report.docx
+++ b/docs/framework/Apex-Implementation-Report.docx
@@ -75,6 +75,104 @@
           <w:i w:val="0"/>
         </w:rPr>
         <w:t>Apex is a split full-stack application: a Next.js 15 (App Router) TypeScript frontend and a Python 3.12 FastAPI backend, communicating over a typed REST API. Server state on the frontend is owned by React Query 5; client/UI state (session, theme, per-phase drafts) by Zustand, persisted to sessionStorage (credentials clear on tab close) or localStorage (drafts) as appropriate. Backend routers are kept thin by design — workflow logic lives in a service layer (backend/app/services/), with Pydantic v2 schemas for every request/response boundary. This separation was a deliberate engineering choice, not an accident of growth: it keeps route handlers testable as thin adapters and workflow logic testable in isolation from HTTP concerns.</w:t>
+      </w:r>
+    </w:p>
+    <w:p>
+      <w:pPr>
+        <w:jc w:val="center"/>
+      </w:pPr>
+      <w:r>
+        <w:drawing>
+          <wp:inline xmlns:a="http://schemas.openxmlformats.org/drawingml/2006/main" xmlns:pic="http://schemas.openxmlformats.org/drawingml/2006/picture">
+            <wp:extent cx="5760720" cy="1610690"/>
+            <wp:docPr id="1" name="Picture 1"/>
+            <wp:cNvGraphicFramePr>
+              <a:graphicFrameLocks noChangeAspect="1"/>
+            </wp:cNvGraphicFramePr>
+            <a:graphic>
+              <a:graphicData uri="http://schemas.openxmlformats.org/drawingml/2006/picture">
+                <pic:pic>
+                  <pic:nvPicPr>
+                    <pic:cNvPr id="0" name="architecture.png"/>
+                    <pic:cNvPicPr/>
+                  </pic:nvPicPr>
+                  <pic:blipFill>
+                    <a:blip r:embed="rId9"/>
+                    <a:stretch>
+                      <a:fillRect/>
+                    </a:stretch>
+                  </pic:blipFill>
+                  <pic:spPr>
+                    <a:xfrm>
+                      <a:off x="0" y="0"/>
+                      <a:ext cx="5760720" cy="1610690"/>
+                    </a:xfrm>
+                    <a:prstGeom prst="rect"/>
+                  </pic:spPr>
+                </pic:pic>
+              </a:graphicData>
+            </a:graphic>
+          </wp:inline>
+        </w:drawing>
+      </w:r>
+    </w:p>
+    <w:p>
+      <w:pPr/>
+      <w:r>
+        <w:rPr>
+          <w:i/>
+          <w:sz w:val="18"/>
+        </w:rPr>
+        <w:t>Figure 1. Apex's system architecture — the Next.js 15 frontend, the FastAPI backend (single-writer), the SSRF-guarded Taiga/Jira/Figma/GitHub proxies, and spec-anchored storage under contextspec/&lt;instance_id&gt;/&lt;project_id&gt;/.</w:t>
+      </w:r>
+    </w:p>
+    <w:p>
+      <w:pPr>
+        <w:jc w:val="center"/>
+      </w:pPr>
+      <w:r>
+        <w:drawing>
+          <wp:inline xmlns:a="http://schemas.openxmlformats.org/drawingml/2006/main" xmlns:pic="http://schemas.openxmlformats.org/drawingml/2006/picture">
+            <wp:extent cx="3840480" cy="7351073"/>
+            <wp:docPr id="2" name="Picture 2"/>
+            <wp:cNvGraphicFramePr>
+              <a:graphicFrameLocks noChangeAspect="1"/>
+            </wp:cNvGraphicFramePr>
+            <a:graphic>
+              <a:graphicData uri="http://schemas.openxmlformats.org/drawingml/2006/picture">
+                <pic:pic>
+                  <pic:nvPicPr>
+                    <pic:cNvPr id="0" name="user-flow.png"/>
+                    <pic:cNvPicPr/>
+                  </pic:nvPicPr>
+                  <pic:blipFill>
+                    <a:blip r:embed="rId10"/>
+                    <a:stretch>
+                      <a:fillRect/>
+                    </a:stretch>
+                  </pic:blipFill>
+                  <pic:spPr>
+                    <a:xfrm>
+                      <a:off x="0" y="0"/>
+                      <a:ext cx="3840480" cy="7351073"/>
+                    </a:xfrm>
+                    <a:prstGeom prst="rect"/>
+                  </pic:spPr>
+                </pic:pic>
+              </a:graphicData>
+            </a:graphic>
+          </wp:inline>
+        </w:drawing>
+      </w:r>
+    </w:p>
+    <w:p>
+      <w:pPr/>
+      <w:r>
+        <w:rPr>
+          <w:i/>
+          <w:sz w:val="18"/>
+        </w:rPr>
+        <w:t>Figure 2. A representative user flow through Apex, phase by phase, showing the actual frontend-to-backend request sequence per phase (POST /phaseN/... calls, AI Engine and PM tool interactions, and spec-store writes).</w:t>
       </w:r>
     </w:p>
     <w:p>

</xml_diff>

<commit_message>
docs: add dated incident log to implementation report, fix stale Redis claim
New section 6 (Incident Log) compiles concrete, dated problems from the
project's own working history into the thesis-facing implementation
report: real production incidents (Taiga egress firewall-drop and its
two follow-on fixes, GitHub PAT reconnect 500, a silently dropped story,
Autopilot fabricating a QA pass), multi-tenancy/security fixes (Taiga
anchor precedence, the Jira anchor-override gap, tonight's Taiga wiki
cross-project leak and publish-selector bugs), concurrency/storage
notes, AI-generation server-side reconciliation fixes, frontend
framework gotchas, and third-party integration reliability issues.
Sourced from the project's own memory records, not reconstructed.

Also fixed a stale claim in section 5: Redis multi-replica coordination
was described as "built and tested but not yet enabled in production" —
it has been live and verified since 2026-06-21.
</commit_message>
<xml_diff>
--- a/docs/framework/Apex-Implementation-Report.docx
+++ b/docs/framework/Apex-Implementation-Report.docx
@@ -557,7 +557,7 @@
         <w:pStyle w:val="ListBullet"/>
       </w:pPr>
       <w:r>
-        <w:t>The single-writer/max-replica-1 constraint (§2.3) is a real scalability ceiling for the current production deployment, not a theoretical one — it was a deliberate trade-off given the project's actual scale and the cost of building out proper distributed storage, with an escape hatch (Redis-backed coordination) already built and tested but not yet enabled in production.</w:t>
+        <w:t>The single-writer/max-replica-1 constraint (§2.3) is a real scalability ceiling for the current production deployment, not a theoretical one — it was a deliberate trade-off given the project's actual scale and the cost of building out proper distributed storage, with an escape hatch (Redis-backed coordination, src/distributed.py) that has since been enabled and verified live in production (2026-06-21: REDIS_URL set to an Upstash instance, max-replicas raised to 3, confirmed via CLIENT LIST showing real Azure Container Apps IPs connected, not just a boot log line).</w:t>
       </w:r>
     </w:p>
     <w:p>
@@ -582,6 +582,432 @@
       </w:pPr>
       <w:r>
         <w:t>This report and the framework specification (Apex-Framework-v2.docx) describe two different things that share a name: this one is about how the Apex codebase was engineered; that one is about the SDLC methodology Apex demonstrates. Citing one for the other's claims would misrepresent both.</w:t>
+      </w:r>
+    </w:p>
+    <w:p>
+      <w:pPr>
+        <w:pStyle w:val="Heading1"/>
+      </w:pPr>
+      <w:r>
+        <w:t>6. Incident Log — Problems Found, Diagnosed, and Fixed</w:t>
+      </w:r>
+    </w:p>
+    <w:p>
+      <w:pPr/>
+      <w:r>
+        <w:t>Section 5 names the two open, accepted trade-offs. This section is different: it is a dated record of concrete problems that actually occurred during Apex's development — bugs, production incidents, and framework gotchas — with their root cause and fix, compiled from the project's own working notes rather than reconstructed after the fact. Nothing here is included because it makes a good story; it is included because it happened and the fix is verifiable in the codebase.</w:t>
+      </w:r>
+    </w:p>
+    <w:p>
+      <w:pPr>
+        <w:pStyle w:val="Heading2"/>
+      </w:pPr>
+      <w:r>
+        <w:t>6.1 Real production incidents</w:t>
+      </w:r>
+    </w:p>
+    <w:p>
+      <w:pPr>
+        <w:pStyle w:val="ListBullet"/>
+      </w:pPr>
+      <w:r>
+        <w:rPr>
+          <w:b/>
+        </w:rPr>
+        <w:t xml:space="preserve">Taiga Cloud egress firewall-drop (2026-06-12). </w:t>
+      </w:r>
+      <w:r>
+        <w:t>The deployed backend could not reach api.taiga.io for roughly ten minutes while Jira egress and general egress stayed fine. Root cause, proven from inside the container: Taiga's host firewall silently drops traffic from Azure Container Apps' egress IP ranges — not a code bug, not transient. Fixed with a Cloudflare Worker egress relay (infra/cloudflare/taiga-relay/) that reaches Taiga from Cloudflare's network instead.</w:t>
+      </w:r>
+    </w:p>
+    <w:p>
+      <w:pPr>
+        <w:pStyle w:val="ListBullet"/>
+      </w:pPr>
+      <w:r>
+        <w:rPr>
+          <w:b/>
+        </w:rPr>
+        <w:t xml:space="preserve">The relay leaked the real Azure IP through a header (2026-06-17). </w:t>
+      </w:r>
+      <w:r>
+        <w:t>Production sign-in started failing with HTTP 520 shortly after the relay shipped. Cloudflare automatically adds an X-Forwarded-For header carrying the caller's IP to the Worker's outbound request; Taiga's edge trusted that header from Cloudflare-to-Cloudflare traffic and forwarded the real Azure IP to its origin, which dropped it — the exact block the relay existed to avoid, now leaking through a header instead of the TCP layer. Fixed by stripping X-Forwarded-For and related headers (X-Forwarded-Host, X-Real-IP, CF-*) in the Worker before forwarding.</w:t>
+      </w:r>
+    </w:p>
+    <w:p>
+      <w:pPr>
+        <w:pStyle w:val="ListBullet"/>
+      </w:pPr>
+      <w:r>
+        <w:rPr>
+          <w:b/>
+        </w:rPr>
+        <w:t xml:space="preserve">The credential check bypassed the relay entirely (2026-06-18). </w:t>
+      </w:r>
+      <w:r>
+        <w:t>Authenticated routes started returning 503 while the Taiga proxy itself kept returning 200 — a confusing split. Cause: deps.py's per-request identity check dialed api.taiga.io directly with its own httpx client instead of going through the same egress path as the proxy, so it hit the same Azure-range block the relay was built to solve. A 60-second token validation cache had been masking the failure until it went cold. Fixed by routing that call through the same egress function. The standing rule since: any new server-side dial to Taiga must go through the shared egress path, never a fresh client.</w:t>
+      </w:r>
+    </w:p>
+    <w:p>
+      <w:pPr>
+        <w:pStyle w:val="ListBullet"/>
+      </w:pPr>
+      <w:r>
+        <w:rPr>
+          <w:b/>
+        </w:rPr>
+        <w:t xml:space="preserve">GitHub PAT reconnect returned 500 and blocked reconnecting at all (2026-07-06). </w:t>
+      </w:r>
+      <w:r>
+        <w:t>A self-inflicted regression from the PAT-persistence feature: the encrypt-and-save call had no error handling (unlike the existing AI-key-save path it should have mirrored), so any encryption failure surfaced as a raw 500 — and because the frontend awaited the server-side persist before updating the local session, that 500 blocked even reconnecting locally in the browser. Fixed on both sides: the backend wraps the encrypt call and degrades to 503 instead of crashing, and the frontend sets the local session first, treating the server-side persist as best-effort.</w:t>
+      </w:r>
+    </w:p>
+    <w:p>
+      <w:pPr>
+        <w:pStyle w:val="ListBullet"/>
+      </w:pPr>
+      <w:r>
+        <w:rPr>
+          <w:b/>
+        </w:rPr>
+        <w:t xml:space="preserve">A story was silently dropped from a live project's index (2026-07-05). </w:t>
+      </w:r>
+      <w:r>
+        <w:t>A story count mismatch between Taiga (40 stories) and Apex's own story-index.json (39) surfaced the gap — one story was never appended during an earlier Phase 1 run. The investigation exposed a second problem: autopilot-job.json held only the latest run with no history, so a later “start at Phase 3” run had overwritten the original Phase 1 run's event log, destroying the trace of what actually happened. The missing story was backfilled from Taiga by hand; the root-cause fix archives each run to autopilot-history/&lt;job_id&gt;.json before it can be overwritten.</w:t>
+      </w:r>
+    </w:p>
+    <w:p>
+      <w:pPr>
+        <w:pStyle w:val="ListBullet"/>
+      </w:pPr>
+      <w:r>
+        <w:rPr>
+          <w:b/>
+        </w:rPr>
+        <w:t xml:space="preserve">Autopilot fabricated a QA pass (2026-07-12). </w:t>
+      </w:r>
+      <w:r>
+        <w:t>The Phase 4 automation generated a test plan and then unconditionally marked the story's QA gate as passed — a fabricated result written straight into story-index.json with no actual verification behind it. Fixed to leave the gate for a real manual pass/fail. That fix exposed a second bug: Phase 5 automation assumed every story reaching it was already qa_passed, so it would have crashed on the first story that genuinely wasn't. Fixed to skip non-passed stories with a warning and report skipped-versus-deployed counts honestly instead of silently overclaiming success.</w:t>
+      </w:r>
+    </w:p>
+    <w:p>
+      <w:pPr>
+        <w:pStyle w:val="Heading2"/>
+      </w:pPr>
+      <w:r>
+        <w:t>6.2 Multi-tenancy &amp; security</w:t>
+      </w:r>
+    </w:p>
+    <w:p>
+      <w:pPr>
+        <w:pStyle w:val="ListBullet"/>
+      </w:pPr>
+      <w:r>
+        <w:rPr>
+          <w:b/>
+        </w:rPr>
+        <w:t xml:space="preserve">The Taiga identity anchor was fixed twice, not once. </w:t>
+      </w:r>
+      <w:r>
+        <w:t>First (2026-06-13): the per-request X-Taiga-Url header originally won over a pinned server anchor, so a rogue Taiga instance could rubber-stamp any token and project, reading another team's context files. Second (2026-06-14): workspace-config's stored taiga_url was dropped from the anchor chain entirely, because it is user-writable, shared across a tenant, and goes stale — a stale cached URL had already caused a real deployment deadlock where a freshly issued token validated against the stale instance, got 401, and a refresh attempt hit the same stale instance again.</w:t>
+      </w:r>
+    </w:p>
+    <w:p>
+      <w:pPr>
+        <w:pStyle w:val="ListBullet"/>
+      </w:pPr>
+      <w:r>
+        <w:rPr>
+          <w:b/>
+        </w:rPr>
+        <w:t xml:space="preserve">Jira never got the same per-request anchor override as Taiga (audit item H4, found and fixed 2026-07-20/21). </w:t>
+      </w:r>
+      <w:r>
+        <w:t>Any PM-authenticated user could flip the shared jira_base_url workspace config and misroute another user's identity and project checks, because Jira had no equivalent to Taiga's X-Taiga-Url override. Fixed by threading a new X-Jira-Base-Url header through the same precedence chain Taiga already used, and by validating the config-sourced Jira base URL on every dial instead of only at config-write time.</w:t>
+      </w:r>
+    </w:p>
+    <w:p>
+      <w:pPr>
+        <w:pStyle w:val="ListBullet"/>
+      </w:pPr>
+      <w:r>
+        <w:rPr>
+          <w:b/>
+        </w:rPr>
+        <w:t xml:space="preserve">The Taiga Wiki “Custom Wiki pages” panel leaked pages across projects (found and fixed 2026-07-21, this session). </w:t>
+      </w:r>
+      <w:r>
+        <w:t>The panel showed several pages all labelled “home” with different content lengths — impossible within one project, since Taiga enforces a unique (project, slug) constraint and a WikiPage's only display field is its slug (verified against taiga-back's own model source). Traced to Taiga Cloud's own list-endpoint filter backend, which ORs in “any project where view_wiki_pages happens to be a public permission,” so the ?project= query parameter does not strictly scope the result set. Fixed by re-filtering every returned row by project id client-side, since Taiga's own endpoint cannot be trusted to do it.</w:t>
+      </w:r>
+    </w:p>
+    <w:p>
+      <w:pPr>
+        <w:pStyle w:val="ListBullet"/>
+      </w:pPr>
+      <w:r>
+        <w:rPr>
+          <w:b/>
+        </w:rPr>
+        <w:t xml:space="preserve">Publishing to the wiki silently ignored the file selection (found and fixed 2026-07-21). </w:t>
+      </w:r>
+      <w:r>
+        <w:t>The Publish-to-Wiki button always sent an empty selection regardless of which checkboxes were checked in the UI, so checking only one context file still published every managed file. Pull used the same selection state correctly; Publish never read it. Fixed to use the checked selection, falling back to “all managed files” only when nothing is checked.</w:t>
+      </w:r>
+    </w:p>
+    <w:p>
+      <w:pPr>
+        <w:pStyle w:val="ListBullet"/>
+      </w:pPr>
+      <w:r>
+        <w:rPr>
+          <w:b/>
+        </w:rPr>
+        <w:t xml:space="preserve">Wiki create-conflict recovery relied on a re-list that could miss the very page it was looking for (found and fixed 2026-07-21). </w:t>
+      </w:r>
+      <w:r>
+        <w:t>On a create-time slug conflict, the recovery path re-listed and paginated every wiki page and filtered client-side — a snapshot that could miss the page Taiga had just reported as existing. Fixed by using Taiga's own authoritative point-lookup endpoint (GET /wiki/by_slug, confirmed against Taiga's API documentation before implementing) instead of a full re-list.</w:t>
+      </w:r>
+    </w:p>
+    <w:p>
+      <w:pPr>
+        <w:pStyle w:val="ListBullet"/>
+      </w:pPr>
+      <w:r>
+        <w:rPr>
+          <w:b/>
+        </w:rPr>
+        <w:t xml:space="preserve">Multi-instance storage isolation (2026-06-14). </w:t>
+      </w:r>
+      <w:r>
+        <w:t>Context files moved from flat, project-id-only storage to contextspec/&lt;instance_id&gt;/&lt;project_id&gt;/, deriving instance_id from the same validated anchor the bearer token was checked against — so a request can only ever reach the storage namespace of an instance its token is actually valid on, and Taiga Cloud and private Taiga deployments can share one Apex deployment as fully isolated tenants.</w:t>
+      </w:r>
+    </w:p>
+    <w:p>
+      <w:pPr>
+        <w:pStyle w:val="Heading2"/>
+      </w:pPr>
+      <w:r>
+        <w:t>6.3 Concurrency &amp; storage</w:t>
+      </w:r>
+    </w:p>
+    <w:p>
+      <w:pPr>
+        <w:pStyle w:val="ListBullet"/>
+      </w:pPr>
+      <w:r>
+        <w:rPr>
+          <w:b/>
+        </w:rPr>
+        <w:t xml:space="preserve">The chunked-request-body size limit had a real bug in an earlier version. </w:t>
+      </w:r>
+      <w:r>
+        <w:t>An earlier middleware implementation read the request body incorrectly (via request._stream directly); it was rewritten as the current _body_size_limit middleware in main.py.</w:t>
+      </w:r>
+    </w:p>
+    <w:p>
+      <w:pPr>
+        <w:pStyle w:val="ListBullet"/>
+      </w:pPr>
+      <w:r>
+        <w:rPr>
+          <w:b/>
+        </w:rPr>
+        <w:t xml:space="preserve">A langchain-core version drift broke test collection (2026-07-12). </w:t>
+      </w:r>
+      <w:r>
+        <w:t>The working environment had langchain-core 0.2.43 installed while requirements.txt pinned ~=1.4.0, so backend tests failed to even collect. Not a code regression — a pure environment-drift incident, fixed by reinstalling from requirements.txt, and a reminder that a pinned requirements file only helps if the environment is actually rebuilt from it.</w:t>
+      </w:r>
+    </w:p>
+    <w:p>
+      <w:pPr>
+        <w:pStyle w:val="Heading2"/>
+      </w:pPr>
+      <w:r>
+        <w:t>6.4 AI-generation correctness (server-side reconciliation)</w:t>
+      </w:r>
+    </w:p>
+    <w:p>
+      <w:pPr>
+        <w:pStyle w:val="ListBullet"/>
+      </w:pPr>
+      <w:r>
+        <w:rPr>
+          <w:b/>
+        </w:rPr>
+        <w:t xml:space="preserve">Phase 3's “N/N scenarios covered” badge was an unverified AI self-report (fixed 2026-06-14). </w:t>
+      </w:r>
+      <w:r>
+        <w:t>The AI's own covered_scenarios claim was being displayed at face value. It is now reconciled server-side against the real, parsed Gherkin scenario titles — a hallucinated title is dropped rather than trusted — and predecessor_task_ids are restricted to real, strictly-lower ids, which as a side effect guarantees the task dependency graph is acyclic.</w:t>
+      </w:r>
+    </w:p>
+    <w:p>
+      <w:pPr>
+        <w:pStyle w:val="ListBullet"/>
+      </w:pPr>
+      <w:r>
+        <w:rPr>
+          <w:b/>
+        </w:rPr>
+        <w:t xml:space="preserve">A runtime-conformance recompute clobbered legitimate existing scores. </w:t>
+      </w:r>
+      <w:r>
+        <w:t>An early version of the Runtime Contract conformance check unconditionally recomputed a story's conformance score every time it ran, even for stories with no runtime-spec.md at all — zeroing out scores that had already been computed correctly. Caught by tests; fixed to only recompute when runtime rows are actually present.</w:t>
+      </w:r>
+    </w:p>
+    <w:p>
+      <w:pPr>
+        <w:pStyle w:val="ListBullet"/>
+      </w:pPr>
+      <w:r>
+        <w:rPr>
+          <w:b/>
+        </w:rPr>
+        <w:t xml:space="preserve">Prompt-cache prefix fragmentation was silently defeating Anthropic's prompt caching. </w:t>
+      </w:r>
+      <w:r>
+        <w:t>Per-task volatile data (sibling-task digests) was being appended into the same system-prompt string as the stable, cacheable header. Since prompt caching is an exact-prefix match, the volatile tail invalidated cache reuse on every sibling task call. Fixed by moving the volatile data into the human message instead, leaving the system prompt byte-identical across sibling calls — flagged honestly as fixed but not yet measured for actual cache-hit-rate improvement.</w:t>
+      </w:r>
+    </w:p>
+    <w:p>
+      <w:pPr>
+        <w:pStyle w:val="ListBullet"/>
+      </w:pPr>
+      <w:r>
+        <w:rPr>
+          <w:b/>
+        </w:rPr>
+        <w:t xml:space="preserve">A section-heading truncation bug cut a live production spec short (2026-07-04). </w:t>
+      </w:r>
+      <w:r>
+        <w:t>Design Delta section parsing was anchored on the writer's own literal section markers, but AI-generated content carries its own “## Endpoints” / “## Data Model” headings — this truncated both the Phase 2 server-side hydration path and the unified technical-spec contract every downstream phase reads, in a real production project. Fixed to read to end-of-file instead of stopping at the next heading match.</w:t>
+      </w:r>
+    </w:p>
+    <w:p>
+      <w:pPr>
+        <w:pStyle w:val="ListBullet"/>
+      </w:pPr>
+      <w:r>
+        <w:rPr>
+          <w:b/>
+        </w:rPr>
+        <w:t xml:space="preserve">rebuild_story_index over-broadly reset design lock status. </w:t>
+      </w:r>
+      <w:r>
+        <w:t>A Design Delta write was sweeping every gherkin_locked story to design_locked, regardless of whether the delta actually applied to it — a late-added story could silently skip Phase 2 design entirely. Fixed by recording which specific story ids a given delta block applies to.</w:t>
+      </w:r>
+    </w:p>
+    <w:p>
+      <w:pPr>
+        <w:pStyle w:val="ListBullet"/>
+      </w:pPr>
+      <w:r>
+        <w:rPr>
+          <w:b/>
+        </w:rPr>
+        <w:t xml:space="preserve">Spec-drift flagging cascaded across an entire project on any edit (removed 2026-07-11 after user feedback). </w:t>
+      </w:r>
+      <w:r>
+        <w:t>Because technical-spec.md and design-bundle.md were single shared files per project, any edit could not be scoped to which stories it actually affected, so the system flagged every story at or past design_locked for review on any change (one real edit flagged 44 downstream stories at once). The flagging cascade was removed; the underlying amendment and versioning audit log was kept.</w:t>
+      </w:r>
+    </w:p>
+    <w:p>
+      <w:pPr>
+        <w:pStyle w:val="Heading2"/>
+      </w:pPr>
+      <w:r>
+        <w:t>6.5 Frontend framework gotchas</w:t>
+      </w:r>
+    </w:p>
+    <w:p>
+      <w:pPr>
+        <w:pStyle w:val="ListBullet"/>
+      </w:pPr>
+      <w:r>
+        <w:rPr>
+          <w:b/>
+        </w:rPr>
+        <w:t xml:space="preserve">TanStack Query silently drops mutation callbacks on unmount. </w:t>
+      </w:r>
+      <w:r>
+        <w:t>A .mutate(vars, {onSuccess, onError}) call's callbacks are tied to the calling component instance; if that component unmounts before the promise resolves — a dialog closing right after the click, for example — the callbacks are dropped even though the mutation succeeds server-side, so the user sees no feedback and assumes it failed. Hit more than once on the same shape of bug before the fix became a standing rule: await mutateAsync() before closing any dialog that owns the mutation, rather than a fire-and-forget .mutate().</w:t>
+      </w:r>
+    </w:p>
+    <w:p>
+      <w:pPr>
+        <w:pStyle w:val="ListBullet"/>
+      </w:pPr>
+      <w:r>
+        <w:rPr>
+          <w:b/>
+        </w:rPr>
+        <w:t xml:space="preserve">useMemo/useCallback dependency omissions broke i18n reactivity. </w:t>
+      </w:r>
+      <w:r>
+        <w:t>A command palette's memoized label list was keyed only on [theme], so switching the UI language did not update the palette until locale was added to the dependency array — a pattern worth checking anywhere t() is called inside a memoized value.</w:t>
+      </w:r>
+    </w:p>
+    <w:p>
+      <w:pPr>
+        <w:pStyle w:val="ListBullet"/>
+      </w:pPr>
+      <w:r>
+        <w:rPr>
+          <w:b/>
+        </w:rPr>
+        <w:t xml:space="preserve">Reflex-era gotchas, from before the migration to Next.js/FastAPI. </w:t>
+      </w:r>
+      <w:r>
+        <w:t>Reflex's Var + str concatenation throws a TypeError, because Var implements __add__ for composing another Var, not string concatenation; rx.select() rejected rx.foreach children and needed the lower-level rx.select.root/trigger/content/item API instead; Reflex does not auto-generate a set_&lt;var&gt; handler for every var; and a button nested inside a &lt;details&gt;/&lt;summary&gt; header double-fired the native disclosure toggle. None of this affects the current stack — kept here only as a historical record of the pre-migration codebase.</w:t>
+      </w:r>
+    </w:p>
+    <w:p>
+      <w:pPr>
+        <w:pStyle w:val="Heading2"/>
+      </w:pPr>
+      <w:r>
+        <w:t>6.6 Third-party integration reliability</w:t>
+      </w:r>
+    </w:p>
+    <w:p>
+      <w:pPr>
+        <w:pStyle w:val="ListBullet"/>
+      </w:pPr>
+      <w:r>
+        <w:rPr>
+          <w:b/>
+        </w:rPr>
+        <w:t xml:space="preserve">Figma's rate limit, once tripped, stayed tripped. </w:t>
+      </w:r>
+      <w:r>
+        <w:t>A single Figma file-verify call could trip Figma's per-token, cost-based 429, after which every subsequent call also 429'd. Fixed with a resilient cache: a fresh window (60 seconds) serves directly, a stale window (900 seconds) serves the last-known-good response on an upstream 429, and a per-key cooldown stops repeated identical calls from hammering an already-tripped bucket.</w:t>
+      </w:r>
+    </w:p>
+    <w:p>
+      <w:pPr>
+        <w:pStyle w:val="ListBullet"/>
+      </w:pPr>
+      <w:r>
+        <w:rPr>
+          <w:b/>
+        </w:rPr>
+        <w:t xml:space="preserve">Figma OAuth was built, then deliberately reverted. </w:t>
+      </w:r>
+      <w:r>
+        <w:t>OAuth requires a one-time operator app registration with a client secret held in backend environment configuration — not the zero-config, in-UI setup that was wanted, since a client secret cannot safely live in a browser field. Reverted to Personal-Access-Token-only as the final decision, not left as an unfinished half-feature.</w:t>
+      </w:r>
+    </w:p>
+    <w:p>
+      <w:pPr>
+        <w:pStyle w:val="ListBullet"/>
+      </w:pPr>
+      <w:r>
+        <w:rPr>
+          <w:b/>
+        </w:rPr>
+        <w:t xml:space="preserve">A stray file in the repo root turned out to be a live, untracked Figma token. </w:t>
+      </w:r>
+      <w:r>
+        <w:t>Found during a routine review, flagged for deletion and revocation, and confirmed it had never been committed to the repository.</w:t>
       </w:r>
     </w:p>
     <w:sectPr>

</xml_diff>

<commit_message>
fix(plane): label the PM tool selector on the login form
Taiga/Plane toggle had no visible label. Adds a small uppercase
'PM Tool' label above it, EN+PT.
</commit_message>
<xml_diff>
--- a/docs/framework/Apex-Implementation-Report.docx
+++ b/docs/framework/Apex-Implementation-Report.docx
@@ -843,6 +843,12 @@
       </w:pPr>
       <w:r>
         <w:t>Plane.so support (§2.4, §6.6) now covers read AND write paths for epic/story/task plus sign-in, live-verified against one real workspace including through the running app itself, still on an unmerged branch. One real gap remains, confirmed live rather than just reasoned about: every backend route sitting behind the request-context dependency (context files, Phase 2/3/6 data, analytics, the Status Mapping settings endpoint) rejects a Plane project because that dependency still assumes Taiga's integer project id. Membership/role management is also still unbuilt. The UI itself degrades gracefully around the gap rather than breaking — the affected panels just render empty.</w:t>
+      </w:r>
+      <w:r>
+        <w:t xml:space="preserve"> </w:t>
+      </w:r>
+      <w:r>
+        <w:t>A detailed phase-4 plan now exists (not yet started): widen the request-context layer's project-id handling, then — the more serious of the two — add a backend-persisted story/epic id mint, since the request-scoping layer's int(item["id"]) currently trusts whatever id a client sends as the permanent story-index key, which is safe for Taiga's stable numeric ids but would silently corrupt story-index entries for Plane's session-local ids across a reload if built against unchanged. A small, separate fix landed the same day: the login form's new Taiga/Plane toggle had no visible label.</w:t>
       </w:r>
     </w:p>
     <w:p>

</xml_diff>

<commit_message>
docs: Apex-Implementation-Report.docx — phase 5a-5f Plane work + updated test counts
New §2.4 paragraph on phase 5's write paths, the second severe
hardcoded-Taiga-anchor bug found/fixed (5a), and its resolution.
§5 Honest Engineering Notes bullet rewritten with an explicit caveat:
today's work is test-suite- and security-review-verified only, not yet
live-tested against a real Plane workspace the way phases 1-4d were —
the 5g members smoke test is deliberately deferred, not silently
skipped. Two new §6.6 incident-log entries (the 5a bug, the
github_webhook.py UUID gap). Headline test counts updated to the
current 1,567 backend / 256 frontend (were 1,380 / 180).
</commit_message>
<xml_diff>
--- a/docs/framework/Apex-Implementation-Report.docx
+++ b/docs/framework/Apex-Implementation-Report.docx
@@ -70,7 +70,7 @@
           <w:b w:val="false"/>
           <w:i w:val="false"/>
         </w:rPr>
-        <w:t>Interview feedback on Apex's academic presentation asked for real engineering documentation — implementation, testing, and deployment — beyond the product-facing README. This document is that record. It describes Apex as of this writing: a split-stack web application with 1,380 backend tests, 180 frontend unit tests, 17 end-to-end specs, and a five-stage CI/CD pipeline deploying to Azure Container Apps. Numbers and file paths in this document are a snapshot — the codebase continues to evolve, and specific counts should be re-verified rather than assumed to still hold if this document is read much later than it was written.</w:t>
+        <w:t>Interview feedback on Apex's academic presentation asked for real engineering documentation — implementation, testing, and deployment — beyond the product-facing README. This document is that record. It describes Apex as of this writing: a split-stack web application with 1,567 backend tests, 256 frontend unit tests, 17 end-to-end specs, and a five-stage CI/CD pipeline deploying to Azure Container Apps. Numbers and file paths in this document are a snapshot — the codebase continues to evolve, and specific counts should be re-verified rather than assumed to still hold if this document is read much later than it was written.</w:t>
       </w:r>
     </w:p>
     <w:p>
@@ -344,6 +344,12 @@
       </w:r>
     </w:p>
     <w:p>
+      <w:pPr/>
+      <w:r>
+        <w:t>Phase 5 (2026-08-08) closed the plan's remaining originally-scoped gaps and, in the process, found a second severe bug of the same shape as phase 4a's: 4a widened get_request_context's own Plane anchor handling, but never audited every OTHER caller of the underlying anchor_instance_id/_verify_project_access functions it widened — several routes in workspace.py and usage.py (personal AI-key save/read, GitHub/Figma config, usage telemetry) still only accepted the Taiga override, so a Plane user's saved AI key was written under the wrong instance folder while the real AI-call path correctly read from a different, empty one — the UI reported “configured” while every actual AI call silently fell back to the deployment's system key, with no error anywhere. Fixed by extending the exact same header-threading pattern to every affected call site (5a), the same mechanical fix repeated once more rather than a new pattern invented under pressure. Autopilot's Plane-write gap, left open at the end of phase 4 (§5), was closed with a narrow five-function write-only Python client (backend/app/services/plane_write_client.py) rather than a second full adapter — a deliberate distinction from what was already rejected for bulk import: import needed full read parity with the tested TypeScript adapter, which would have been genuine duplication; Autopilot needs only create/join/delete, a much smaller surface, and runs in a background thread pool with no browser round-trip to lean on the existing adapter through. AI-assisted Gherkin reconstruction for a Plane import now works too, using the same “frontend fetches, backend processes” shape phase 4c already established rather than a new server-side cache. Plane's task/story web deep-link scheme, an open unknown since phase 2, was resolved by reading Plane's own current frontend source directly rather than left guessed-at. A dedicated security review of the full day's diff (mirroring 4a's own two-pass discipline) found no further issues before this was considered done — see §6.6 for both bugs' full incident-log entries.</w:t>
+      </w:r>
+    </w:p>
+    <w:p>
       <w:pPr>
         <w:pStyle w:val="Heading2"/>
         <w:rPr/>
@@ -435,7 +441,7 @@
           <w:b w:val="false"/>
           <w:i w:val="false"/>
         </w:rPr>
-        <w:t>1,380 tests as of this writing (python -m pytest tests/ -v --tb=short), gated in CI before any Docker build is even attempted. Six autouse fixtures in tests/conftest.py remove entire categories of flaky-test risk by construction rather than by convention:</w:t>
+        <w:t>1,567 tests as of this writing (python -m pytest tests/ -v --tb=short), gated in CI before any Docker build is even attempted. Six autouse fixtures in tests/conftest.py remove entire categories of flaky-test risk by construction rather than by convention:</w:t>
       </w:r>
     </w:p>
     <w:p>
@@ -569,7 +575,7 @@
           <w:b w:val="false"/>
           <w:i w:val="false"/>
         </w:rPr>
-        <w:t>180 unit tests (Vitest) cover hooks, pure utility functions, and component rendering. 17 end-to-end specs (Playwright, Chromium) exercise one full phase flow each against mocked backend and Taiga APIs — critically, the mocking happens at the Chromium network layer (page.route()), not by swapping out modules in a Node test runner (MSW), because it needs to intercept requests the real browser makes during real navigation, matching what a user's browser actually does more closely than a Node-level module mock would.</w:t>
+        <w:t>256 unit tests (Vitest) cover hooks, pure utility functions, and component rendering. 17 end-to-end specs (Playwright, Chromium) exercise one full phase flow each against mocked backend and Taiga APIs — critically, the mocking happens at the Chromium network layer (page.route()), not by swapping out modules in a Node test runner (MSW), because it needs to intercept requests the real browser makes during real navigation, matching what a user's browser actually does more closely than a Node-level module mock would.</w:t>
       </w:r>
     </w:p>
     <w:p>
@@ -829,7 +835,7 @@
       </w:pPr>
       <w:r>
         <w:rPr/>
-        <w:t>Numbers in this document (1,380 backend tests, 180 frontend tests, 17 E2E specs) are a snapshot as of this writing and will drift as the codebase grows — re-run the counts (§1) rather than citing this document as the current figure without checking.</w:t>
+        <w:t>Numbers in this document (1,567 backend tests, 256 frontend tests, 17 E2E specs) are a snapshot as of this writing and will drift as the codebase grows — re-run the counts (§1) rather than citing this document as the current figure without checking.</w:t>
       </w:r>
     </w:p>
     <w:p>
@@ -851,7 +857,7 @@
         <w:pStyle w:val="ListBullet"/>
       </w:pPr>
       <w:r>
-        <w:t>Plane.so support (§2.4, §6.6) now covers the full originally-scoped plan: read and write paths for epic/story/task, sign-in, project-scoped backend access, bulk import, and members/roles (phases 4a-4d), live-verified against one real workspace including through the running app itself, still on an unmerged branch. A critical path-traversal vulnerability was introduced and then found and fixed within the same phase (§6.6) — worth citing here as a concrete instance of why every access-control change on this codebase goes through a dedicated security review before being considered done, not just a green test suite. Three real gaps remain, all found through direct investigation rather than assumed and all deliberately left open with a stated reason instead of being guessed at: Autopilot has its own, entirely separate, Taiga-only write path that silently produces nothing in Plane; AI-assisted Gherkin reconstruction for a Plane import isn't built; and Plane task/story deep-links into its own web UI aren't built, pending confirmation of Plane's actual URL scheme.</w:t>
+        <w:t>Plane.so support (§2.4, §6.2, §6.6) now covers the full originally-scoped plan, including phase 5's follow-on work (2026-08-08): read and write paths for epic/story/task, sign-in, project-scoped backend access, bulk import, members/roles, Autopilot writes, AI-assisted reconstruction, and web deep-links — still on an unmerged branch. Two separate severe bugs were introduced and then found and fixed by dedicated security review, not by the test suite going green (§6.6) — the second (phase 5a) was a different call-site family of the exact same underlying bug class as the first (phase 4a): widening one function's Plane support and assuming every caller of the functions underneath it had been audited, when it hadn't. The honest caveat worth stating plainly: this session's phase 5a-5f work is verified by an automated test suite (1,567 backend, 256 frontend, all green) and by a dedicated security-reviewer pass over the full diff — it has NOT been live-tested against a real running Plane workspace the way phases 1-4d were (§2.4's Playwright-verified sign-in flow, live API probes that overturned assumed field shapes). A live members-write-path smoke test was scoped for this same session and deliberately deferred rather than skipped silently: it needs a disposable Plane account's real credentials, which get entered manually rather than by this assistant regardless of instruction, so it is left for manual execution.</w:t>
       </w:r>
       <w:r/>
       <w:r/>
@@ -1512,6 +1518,22 @@
       </w:pPr>
       <w:r>
         <w:t>story-index.json's story/epic ids were, until 2026-08-06, implicitly assumed stable and PM-supplied everywhere they're used (a Markdown-heading regex, the index's own dict keys) — true for Taiga's real numeric ids, reused directly with no translation layer, but silently wrong for Plane: the id Phase 1's story-creation flow was about to trust as permanent was actually the frontend's session-local shim value, which would mint a different number for the same real story after every reload. Caught by tracing the actual trust boundary (not just testing the happy path) before any real story ever got created against a Plane project through the running app. Fixed with a backend-persisted id mint, separate from and complementary to the frontend's session-local one, that survives reloads and is shared across every user touching the same project.</w:t>
+      </w:r>
+    </w:p>
+    <w:p>
+      <w:pPr>
+        <w:pStyle w:val="ListBullet"/>
+      </w:pPr>
+      <w:r>
+        <w:t>A second, more severe hardcoded-Taiga-anchor bug was found during a fresh verification pass ahead of phase 5 (2026-08-07/08), distinct from phase 4a's fix and not caught by it: 4a widened get_request_context (the dependency gating context files, Phase 2/3/6 data, analytics, Status Mapping) to accept a Plane anchor, but several OTHER callers of the same underlying anchor_instance_id/_verify_project_access functions — personal AI-key save and read, GitHub/Figma config save and read, and usage-telemetry summary, all in workspace.py/usage.py — still only threaded the Taiga override. Traced to a concrete, confirmed-not-theoretical failure: a Plane user's saved AI key was written under the Taiga-anchored instance folder and read back from that same wrong folder, so the settings UI self-consistently reported it as configured, while the real AI-call path (deps.py's _load_personal_ai_keys, which WAS correctly Plane-aware from the start) read from the correct, different, actually-empty folder and silently fell back to the deployment's system API key — no error surfaced anywhere. Fixed by extending the same two-argument/five-argument header-threading pattern 4a already established to every affected route (2026-08-08), plus widening the affected project_id query/body fields through the existing strict deps._parse_project_id shape check rather than trusting FastAPI's bare int typing. A dedicated security-reviewer pass over the complete day's diff, covering all six changed-surface areas (auth plumbing, the new Autopilot write client's SSRF pinning, mint_pm_id data flow, the rewritten Autopilot /start route, the new reconstruct-epic request body, and the frontend project-id resolver), found no further issues.</w:t>
+      </w:r>
+    </w:p>
+    <w:p>
+      <w:pPr>
+        <w:pStyle w:val="ListBullet"/>
+      </w:pPr>
+      <w:r>
+        <w:t>The GitHub push-webhook receiver (backend/app/api/github_webhook.py, POST /github/{instance_id}/{project_id}) hardcoded project_id as an int path parameter — found the same day (2026-08-08) as a follow-on to the 5a sweep above, while auditing every other caller of project-scoping helpers for the same bug class. FastAPI validates a path parameter against its declared type before the route handler even runs, so a Plane project's UUID would have 422'd outright had a Plane user ever configured a GitHub webhook — a different code path from every 5a site (this route is the public, unauthenticated webhook receiver, gated by HMAC signature rather than a bearer token, so it was outside the audit surface the earlier fixes covered). Fixed by widening the path parameter to a plain string and parsing it through the same strict deps._parse_project_id gate used everywhere else, before it reaches the signature check's project-scoped secret lookup or any downstream write. A matching frontend bug was fixed alongside it: the webhook payload-URL builder in github-section.tsx used the raw, session-local Plane id-shim integer (meaningless outside the browser tab that minted it, and not stable across a reload) instead of resolving it to the real, durable UUID first — a URL copied into GitHub's own webhook settings from the unresolved value would have pointed at a project id that stopped meaning anything the moment the tab was closed.</w:t>
       </w:r>
     </w:p>
     <w:sectPr>

</xml_diff>

<commit_message>
docs(framework): update implementation report for Plane 5g-5l + self-hosted click-through attempt
- merge status fixed (main since 2026-08-10, was still saying unmerged branch)
- Phase 5g-5l summary added to §2.4 (Project CRUD, invites, Pages sync,
  self-hosted infra, PM-issue import, automated script, the 3 mitigated
  API limitations)
- test counts refreshed to 1,591 backend / 304 frontend (§1, §5)
- §5 honest note: 2 live-testing tasks still open, self-hosted click-through
  attempt documented (Docker Desktop = user systemd service, cloudflared
  needs --protocol http2 in this sandbox — blocked at the credential-entry
  step per standing rule, handed off to Tomás)
- §6.6 incident log: self-hosted AIO image restructure + DOMAIN_NAME
  chicken-and-egg, script readiness-check bug, cloudflared QUIC finding
</commit_message>
<xml_diff>
--- a/docs/framework/Apex-Implementation-Report.docx
+++ b/docs/framework/Apex-Implementation-Report.docx
@@ -70,7 +70,7 @@
           <w:b w:val="false"/>
           <w:i w:val="false"/>
         </w:rPr>
-        <w:t>Interview feedback on Apex's academic presentation asked for real engineering documentation — implementation, testing, and deployment — beyond the product-facing README. This document is that record. It describes Apex as of this writing: a split-stack web application with 1,567 backend tests, 256 frontend unit tests, 17 end-to-end specs, and a five-stage CI/CD pipeline deploying to Azure Container Apps. Numbers and file paths in this document are a snapshot — the codebase continues to evolve, and specific counts should be re-verified rather than assumed to still hold if this document is read much later than it was written.</w:t>
+        <w:t>Interview feedback on Apex's academic presentation asked for real engineering documentation — implementation, testing, and deployment — beyond the product-facing README. This document is that record. It describes Apex as of this writing: a split-stack web application with 1,591 backend tests, 304 frontend unit tests, 17 end-to-end specs, and a five-stage CI/CD pipeline deploying to Azure Container Apps. Numbers and file paths in this document are a snapshot — the codebase continues to evolve, and specific counts should be re-verified rather than assumed to still hold if this document is read much later than it was written.</w:t>
       </w:r>
     </w:p>
     <w:p>
@@ -325,7 +325,7 @@
     <w:p>
       <w:pPr/>
       <w:r>
-        <w:t>A second PM integration, Plane.so, is under active development on a separate branch (plane.so-integration, not yet merged), driven by a real external requirement rather than a speculative feature: a partner organization using Apex is itself migrating to Plane.so, so compatibility with their real workspace — not just Taiga — became a concrete need. It follows the same proxy-first pattern: backend/app/api/plane_proxy.py mirrors the Taiga/Jira proxy's SSRF guard exactly, but Plane's own auth shape differs — a single Personal Access Token (X-Api-Key header, generated by the user in Plane's own UI) rather than a username/password exchange, so deps.py's identity-anchor logic was generalized to translate between the two upstream auth shapes (Authorization: Bearer for Taiga, X-Api-Key for Plane) without the frontend needing to know which is which. Plane's own ids are UUIDs rather than Taiga's small integers, which the frontend's shared Story/Epic types assume are numbers in over 30 call sites elsewhere in the codebase (board rendering, drag-drop state); rather than widening that type, the adapter mints a synthetic per-session integer id and carries the real UUID in a new optional field, mirroring a split the codebase already used for tasks (PmTask.id vs pm_task_id).</w:t>
+        <w:t>A second PM integration, Plane.so, merged to main on 2026-08-10 after a real stakeholder scope change — a partner organization migrating to Plane.so needs full Taiga parity, not just the narrower confirmed-needs bar earlier phases assumed — driven by a real external requirement rather than a speculative feature: a partner organization using Apex is itself migrating to Plane.so, so compatibility with their real workspace — not just Taiga — became a concrete need. It follows the same proxy-first pattern: backend/app/api/plane_proxy.py mirrors the Taiga/Jira proxy's SSRF guard exactly, but Plane's own auth shape differs — a single Personal Access Token (X-Api-Key header, generated by the user in Plane's own UI) rather than a username/password exchange, so deps.py's identity-anchor logic was generalized to translate between the two upstream auth shapes (Authorization: Bearer for Taiga, X-Api-Key for Plane) without the frontend needing to know which is which. Plane's own ids are UUIDs rather than Taiga's small integers, which the frontend's shared Story/Epic types assume are numbers in over 30 call sites elsewhere in the codebase (board rendering, drag-drop state); rather than widening that type, the adapter mints a synthetic per-session integer id and carries the real UUID in a new optional field, mirroring a split the codebase already used for tasks (PmTask.id vs pm_task_id).</w:t>
       </w:r>
       <w:r>
         <w:t xml:space="preserve"> Phase 3 (2026-08-06) added the write paths on top of that read-only adapter: create/update/delete for epic/story/task, plus a get-or-create helper for Plane's work-item Labels (a separate, identically-named resource from Plane's per-project Labels — easy to wire to the wrong endpoint by name alone). Deleting an epic/module cascades to its joined work items first, mirroring the existing Taiga adapter's delete-epic semantics, since Plane's epic/module membership is itself a join, not ownership. This phase found zero real-API surprises, a contrast with phases 1-2's four, most likely because exact request/response field names were pinned with a manual API probe against the real workspace before any adapter code was written, rather than discovered live after the fact — the same discipline, applied one step earlier in the process.</w:t>
@@ -350,6 +350,18 @@
       </w:r>
     </w:p>
     <w:p>
+      <w:pPr/>
+      <w:r>
+        <w:t>Phases 5g-5l (2026-08-10 through 2026-08-12) closed out full Taiga parity and then went beyond it. Project CRUD (create/edit/delete) was live-verified by Tomás directly against a real Plane workspace (2026-08-10), which also surfaced and fixed a real cross-session bug: the active-project selection for a Plane session was never persisted server-side, a stale skip left over from before save_config could handle a Plane UUID. Workspace invites (5i, 2026-08-11) fall back to Plane's Workspace Invitations API when the invitee isn't already a workspace member — honestly not the same one-step outcome Taiga gives, since Plane's project and workspace membership are separate resources with no atomic bridge between them, surfaced to the UI via a widened return type rather than papered over. The same session added a Plane Pages wiki-sync equivalent to Taiga Wiki (backend/app/services/plane_wiki_service.py), routed through the same three wiki-status/publish/pull endpoints Taiga already used. Self-hosted Plane compatibility (5j, 2026-08-11) was tested for the first time — Docker Compose (Plane's prebuilt All-In-One image, not a from-source build) plus a cloudflared tunnel, mirroring the existing Taiga self-host testing workflow; the SSRF guard and error-body parsing both passed unchanged against a real self-hosted instance. Phase 5k (2026-08-11) added Phase 6 maintenance-triage PM-issue import for Plane and scripts/private-plane-cloud.sh, an automated self-hosted provisioning script that creates an admin user, workspace, and a ready API token entirely via Django ORM manipulation (Plane ships no createsuperuser-equivalent command for this) — in one respect more automated than Taiga's own equivalent script, since it prints a working token rather than requiring a username/password to be typed into Apex's sign-in form. This closed the last two build gaps; everything remaining for Plane is either a genuine, permanent API limitation or a live human-testing task, not missing code.</w:t>
+      </w:r>
+    </w:p>
+    <w:p>
+      <w:pPr/>
+      <w:r>
+        <w:t>Three of Plane's API gaps are permanent (confirmed against developers.plane.so, not assumed) rather than missing Apex code, so Phase 5l (2026-08-12) built app-level mitigations instead of waiting on an upstream fix: the Pages API has no update or delete endpoint, so republishing an already-published context file now creates a new titled version ("&lt;title&gt; (vN)") rather than blocking, with an orphaned-version count surfaced in the UI for manual cleanup in Plane; there is no task-level optimistic-concurrency field, so writes now carry Plane's own updated_at timestamp as an advisory version and a pre-write GET throws a typed conflict error that plugs directly into the same retry-once-then-refetch flow Taiga's real 409 already drives, with zero UI changes; and there is no server-side label name filter, so the existing client-side match now caches the full label list per project for two minutes instead of re-fetching it on every single story/epic/task save. None of the three are real fixes — the underlying API gaps are permanent — but each makes the practical consequence smaller. docs/plane-integration.md was restructured the same day to keep these three, once mitigated, out of the active backlog list entirely (a separate "resolved / mitigated" record section), so the document's open backlog reads as genuinely open work, not a mix of open items and settled history.</w:t>
+      </w:r>
+    </w:p>
+    <w:p>
       <w:pPr>
         <w:pStyle w:val="Heading2"/>
         <w:rPr/>
@@ -835,7 +847,7 @@
       </w:pPr>
       <w:r>
         <w:rPr/>
-        <w:t>Numbers in this document (1,567 backend tests, 256 frontend tests, 17 E2E specs) are a snapshot as of this writing and will drift as the codebase grows — re-run the counts (§1) rather than citing this document as the current figure without checking.</w:t>
+        <w:t>Numbers in this document (1,591 backend tests, 304 frontend tests, 17 E2E specs) are a snapshot as of this writing and will drift as the codebase grows — re-run the counts (§1) rather than citing this document as the current figure without checking.</w:t>
       </w:r>
     </w:p>
     <w:p>
@@ -857,10 +869,18 @@
         <w:pStyle w:val="ListBullet"/>
       </w:pPr>
       <w:r>
-        <w:t>Plane.so support (§2.4, §6.2, §6.6) now covers the full originally-scoped plan, including phase 5's follow-on work (2026-08-08): read and write paths for epic/story/task, sign-in, project-scoped backend access, bulk import, members/roles, Autopilot writes, AI-assisted reconstruction, and web deep-links — still on an unmerged branch. Two separate severe bugs were introduced and then found and fixed by dedicated security review, not by the test suite going green (§6.6) — the second (phase 5a) was a different call-site family of the exact same underlying bug class as the first (phase 4a): widening one function's Plane support and assuming every caller of the functions underneath it had been audited, when it hadn't. The honest caveat worth stating plainly: this session's phase 5a-5f work is verified by an automated test suite (1,567 backend, 256 frontend, all green) and by a dedicated security-reviewer pass over the full diff — it has NOT been live-tested against a real running Plane workspace the way phases 1-4d were (§2.4's Playwright-verified sign-in flow, live API probes that overturned assumed field shapes). A live members-write-path smoke test was scoped for this same session and deliberately deferred rather than skipped silently: it needs a disposable Plane account's real credentials, which get entered manually rather than by this assistant regardless of instruction, so it is left for manual execution.</w:t>
+        <w:t>Plane.so support (§2.4, §6.2, §6.6) now covers the full originally-scoped plan, including phase 5's follow-on work (2026-08-08): read and write paths for epic/story/task, sign-in, project-scoped backend access, bulk import, members/roles, Autopilot writes, AI-assisted reconstruction, and web deep-links — merged to main 2026-08-10, then extended through 2026-08-12 to Project CRUD, workspace invites, Pages wiki-sync, self-hosted infra compatibility, PM-issue import, and an automated self-hosted provisioning script (§2.4). Two separate severe bugs were introduced and then found and fixed by dedicated security review, not by the test suite going green (§6.6) — the second (phase 5a) was a different call-site family of the exact same underlying bug class as the first (phase 4a): widening one function's Plane support and assuming every caller of the functions underneath it had been audited, when it hadn't. The honest caveat worth stating plainly: phase 5a-5f's work was verified by an automated test suite (1,567 backend, 256 frontend, all green at the time) and by a dedicated security-reviewer pass over the full diff — it has NOT been live-tested against a real running Plane workspace the way phases 1-4d were (§2.4's Playwright-verified sign-in flow, live API probes that overturned assumed field shapes). A live members-write-path smoke test was scoped for this same session and deliberately deferred rather than skipped silently: it needs a disposable Plane account's real credentials, which get entered manually rather than by this assistant regardless of instruction, so it is left for manual execution.</w:t>
       </w:r>
       <w:r/>
       <w:r/>
+    </w:p>
+    <w:p>
+      <w:pPr>
+        <w:pStyle w:val="ListBullet"/>
+      </w:pPr>
+      <w:r>
+        <w:t>Two Plane live-testing tasks remain open, both requiring a real human credential this assistant will not enter itself: a Plane-Cloud members write-path smoke test (invite/role-change/remove), and a self-hosted feature-level UI click-through. The second was attempted directly by this assistant (2026-08-17/18) using scripts/private-plane-cloud.sh: Docker Desktop (a user-level systemd service on this Linux dev machine, not the system docker.service unit one might expect) and the self-hosted stack were both brought up successfully, and a genuine environment issue was found and fixed along the way — the script's own cloudflared tunnel defaults to QUIC/UDP transport, which this sandbox blocks or severely restricts, so the tunnel never registered a connection; forcing --protocol http2 (TCP-based) fixed it immediately, though the script itself doesn't yet expose a flag for that override. Direct, read-only diagnostic API calls against the tunnel with the script's auto-provisioned token confirmed the instance was reachable and correctly authenticated (401 with no token, 200 with it). The actual sign-in step inside Apex's own UI was deliberately not performed — entering a token into a login field is prohibited for this assistant regardless of instruction, even for a disposable local instance it stood up itself — so the click-through's UI-driven verification is still a task for Tomás, now cheaper to run than before since the environment and a ready token are already provisioned.</w:t>
+      </w:r>
     </w:p>
     <w:p>
       <w:pPr>
@@ -1534,6 +1554,22 @@
       </w:pPr>
       <w:r>
         <w:t>The GitHub push-webhook receiver (backend/app/api/github_webhook.py, POST /github/{instance_id}/{project_id}) hardcoded project_id as an int path parameter — found the same day (2026-08-08) as a follow-on to the 5a sweep above, while auditing every other caller of project-scoping helpers for the same bug class. FastAPI validates a path parameter against its declared type before the route handler even runs, so a Plane project's UUID would have 422'd outright had a Plane user ever configured a GitHub webhook — a different code path from every 5a site (this route is the public, unauthenticated webhook receiver, gated by HMAC signature rather than a bearer token, so it was outside the audit surface the earlier fixes covered). Fixed by widening the path parameter to a plain string and parsing it through the same strict deps._parse_project_id gate used everywhere else, before it reaches the signature check's project-scoped secret lookup or any downstream write. A matching frontend bug was fixed alongside it: the webhook payload-URL builder in github-section.tsx used the raw, session-local Plane id-shim integer (meaningless outside the browser tab that minted it, and not stable across a reload) instead of resolving it to the real, durable UUID first — a URL copied into GitHub's own webhook settings from the unresolved value would have pointed at a project id that stopped meaning anything the moment the tab was closed.</w:t>
+      </w:r>
+    </w:p>
+    <w:p>
+      <w:pPr>
+        <w:pStyle w:val="ListBullet"/>
+      </w:pPr>
+      <w:r>
+        <w:t>Self-hosted Plane's official deployment layout had moved since it was first researched (2026-08-11): the docs previously pointed at a build-from-source Docker Compose path that now 404s, and real self-hosters instead run Plane's prebuilt All-In-One image (makeplane/plane-aio-community, no :latest tag — confirmed via the Docker Hub tags API, only versioned tags like :stable exist). The AIO image needs external Postgres/Redis/RabbitMQ/S3-compatible storage wired up separately; it does not bundle them. A second, easy-to-misread gotcha: DOMAIN_NAME is baked in at container start for CSRF/CORS trusted-origins, but a quick tunnel's hostname is only known after the container is already listening — resolved by bringing the stack up once with a placeholder domain, starting the tunnel, then force-recreating the one container with the real hostname. Found by standing the stack up for real rather than trusting the then-current docs; the SSRF guard and error-body parsing both passed unchanged against the corrected setup, confirming the original self-hosted-aware design was already correct, just never exercised.</w:t>
+      </w:r>
+    </w:p>
+    <w:p>
+      <w:pPr>
+        <w:pStyle w:val="ListBullet"/>
+      </w:pPr>
+      <w:r>
+        <w:t>The self-hosted provisioning script's own readiness check silently wasted its entire retry budget on every run (2026-08-11): a bare curl -f against an endpoint that correctly answers 401 when healthy treats that 401 as a failure, so the check burned through 90 retries (~7.5 minutes) before falling through to a second, correct check that actually inspected the status code. Caught by reading the script's own log output after a real run, not by inspection; removing the dead first check cut a real run from ~8 minutes to under 15 seconds when the stack was already up. Separately (2026-08-17/18, this assistant's own live click-through attempt), the same script's auto-launched cloudflared tunnel never registered a connection in this sandbox environment — its default QUIC/UDP transport appears to be blocked or badly throttled here, producing an endless retry loop and a hostname that never resolved. Forcing --protocol http2 (TCP-based) on a manually-started replacement tunnel fixed it on the first attempt; the script does not yet expose a flag for that override, a real, if narrow, gap worth closing if this sandbox's networking restriction turns out to be a recurring condition rather than a one-off.</w:t>
       </w:r>
     </w:p>
     <w:sectPr>

</xml_diff>

<commit_message>
docs(plane): update implementation report
</commit_message>
<xml_diff>
--- a/docs/framework/Apex-Implementation-Report.docx
+++ b/docs/framework/Apex-Implementation-Report.docx
@@ -352,7 +352,7 @@
     <w:p>
       <w:pPr/>
       <w:r>
-        <w:t>Phases 5g-5l (2026-08-10 through 2026-08-12) closed out full Taiga parity and then went beyond it. Project CRUD (create/edit/delete) was live-verified by Tomás directly against a real Plane workspace (2026-08-10), which also surfaced and fixed a real cross-session bug: the active-project selection for a Plane session was never persisted server-side, a stale skip left over from before save_config could handle a Plane UUID. Workspace invites (5i, 2026-08-11) fall back to Plane's Workspace Invitations API when the invitee isn't already a workspace member — honestly not the same one-step outcome Taiga gives, since Plane's project and workspace membership are separate resources with no atomic bridge between them, surfaced to the UI via a widened return type rather than papered over. The same session added a Plane Pages wiki-sync equivalent to Taiga Wiki (backend/app/services/plane_wiki_service.py), routed through the same three wiki-status/publish/pull endpoints Taiga already used. Self-hosted Plane compatibility (5j, 2026-08-11) was tested for the first time — Docker Compose (Plane's prebuilt All-In-One image, not a from-source build) plus a cloudflared tunnel, mirroring the existing Taiga self-host testing workflow; the SSRF guard and error-body parsing both passed unchanged against a real self-hosted instance. Phase 5k (2026-08-11) added Phase 6 maintenance-triage PM-issue import for Plane and scripts/private-plane-cloud.sh, an automated self-hosted provisioning script that creates an admin user, workspace, and a ready API token entirely via Django ORM manipulation (Plane ships no createsuperuser-equivalent command for this) — in one respect more automated than Taiga's own equivalent script, since it prints a working token rather than requiring a username/password to be typed into Apex's sign-in form. This closed the last two build gaps; everything remaining for Plane is either a genuine, permanent API limitation or a live human-testing task, not missing code.</w:t>
+        <w:t>Phases 5g-5l (2026-08-10 through 2026-08-12) closed out full Taiga parity and then went beyond it. Project CRUD (create/edit/delete) was live-verified by Tomás directly against a real Plane workspace (2026-08-10), which also surfaced and fixed a real cross-session bug: the active-project selection for a Plane session was never persisted server-side, a stale skip left over from before save_config could handle a Plane UUID. Workspace invites (5i, 2026-08-11) fall back to Plane's Workspace Invitations API when the invitee isn't already a workspace member — honestly not the same one-step outcome Taiga gives, since Plane's project and workspace membership are separate resources with no atomic bridge between them, surfaced to the UI via a widened return type rather than papered over. The same session added a Plane Pages wiki-sync equivalent to Taiga Wiki (backend/app/services/plane_wiki_service.py), routed through the same three wiki-status/publish/pull endpoints Taiga already used. Self-hosted Plane compatibility (5j, 2026-08-11) was tested for the first time — Docker Compose (Plane's prebuilt All-In-One image, not a from-source build) plus a cloudflared tunnel, mirroring the existing Taiga self-host testing workflow; the SSRF guard and error-body parsing both passed unchanged against a real self-hosted instance. Phase 5k (2026-08-11) added Phase 6 maintenance-triage PM-issue import for Plane and scripts/private-plane-cloud.sh, an automated self-hosted provisioning script that creates an admin user, workspace, and a ready API token entirely via Django ORM manipulation (Plane ships no createsuperuser-equivalent command for this) — in one respect more automated than Taiga's own equivalent script, since it prints a working token rather than requiring a username/password to be typed into Apex's sign-in form. A clean end-to-end self-hosted click-through on 2026-08-19 then closed the remaining local verification gap: auth through Apex's Plane proxy, Project CRUD, Active Context non-zero reload behavior, module-backed epics/stories, Phase 1 finalize, Task Board child work items, existing-member add/role/remove, Pages degraded publish on self-hosted CE, browser restore, and Phase 6 Plane maintenance import all passed against a real self-hosted Plane dashboard.</w:t>
       </w:r>
     </w:p>
     <w:p>
@@ -620,11 +620,7 @@
         <w:rPr/>
       </w:pPr>
       <w:r>
-        <w:rPr>
-          <w:b w:val="false"/>
-          <w:i w:val="false"/>
-        </w:rPr>
-        <w:t>Five independent test jobs must all pass before any Docker image is built: backend tests + ruff lint, frontend typecheck + lint + unit tests + a production build, the Cloudflare Worker relay's own dependency-free node:test suite, the Playwright E2E suite (depends on the frontend job), and a real-stack smoke test (depends on both backend and frontend jobs) that boots the actual FastAPI and Next.js processes and asserts on live HTTP behavior — not mocks. The smoke test is deliberately narrow but points at a real production incident class: it asserts a bogus bearer token is rejected (401/503, never 200) both with and without the multi-instance X-Taiga-Url header present, because a prior regression let a bogus token reach workspace data when validation anchored on the wrong thing. Only after all five test jobs pass do the backend and frontend Docker images get built and pushed to GHCR, and only after both images build does the deploy job run.</w:t>
+        <w:t>Five independent test jobs must all pass before any Docker image is built: backend tests + ruff lint, frontend typecheck + lint + unit tests + a production build, the Cloudflare Worker relay's own dependency-free node:test suite, the Playwright E2E suite (depends on the frontend job), and a real-stack smoke test (depends on both backend and frontend jobs) that boots the actual FastAPI and Next.js processes and asserts on live HTTP behavior — not mocks. The smoke test is deliberately narrow but points at a real production incident class: it asserts a bogus bearer token is rejected (401/503, never 200) both with and without the multi-instance X-Taiga-Url header present, because a prior regression let a bogus token reach workspace data when validation anchored on the wrong thing. Only after all five test jobs pass do the backend and frontend Docker images get built and pushed to GHCR, and only after both images build does the deploy job run. The 2026-08-20 rerun of the Plane Cloud smoke-runner commit is also a useful operational data point: the first attempt was cancelled after GitHub Actions wedged for roughly four hours inside `npx playwright install --with-deps chromium`, not inside Apex's tests; rerunning the same commit passed Playwright in 2m13s and deployed successfully.</w:t>
       </w:r>
     </w:p>
     <w:p>
@@ -869,17 +865,15 @@
         <w:pStyle w:val="ListBullet"/>
       </w:pPr>
       <w:r>
-        <w:t>Plane.so support (§2.4, §6.6) now covers the full originally-scoped plan, including phase 5's follow-on work (2026-08-08): read and write paths for epic/story/task, sign-in, project-scoped backend access, bulk import, members/roles, Autopilot writes, AI-assisted reconstruction, and web deep-links — merged to main 2026-08-10, then extended through 2026-08-12 to Project CRUD, workspace invites, Pages wiki-sync, self-hosted infra compatibility, PM-issue import, and an automated self-hosted provisioning script (§2.4). Two separate severe bugs were introduced and then found and fixed by dedicated security review, not by the test suite going green (§6.6) — the second (phase 5a) was a different call-site family of the exact same underlying bug class as the first (phase 4a): widening one function's Plane support and assuming every caller of the functions underneath it had been audited, when it hadn't. The honest caveat worth stating plainly: phase 5a-5f's work was verified by an automated test suite (1,567 backend, 256 frontend, all green at the time) and by a dedicated security-reviewer pass over the full diff — it has NOT been live-tested against a real running Plane workspace the way phases 1-4d were (§2.4's Playwright-verified sign-in flow, live API probes that overturned assumed field shapes). A live members-write-path smoke test was scoped for this same session and deliberately deferred rather than skipped silently: it needs a disposable Plane account's real credentials, which get entered manually rather than by this assistant regardless of instruction, so it is left for manual execution.</w:t>
+        <w:t>Plane.so support (§2.4, §6.6) now covers the full originally-scoped plan, including phase 5's follow-on work (2026-08-08): read and write paths for epic/story/task, sign-in, project-scoped backend access, bulk import, members/roles, Autopilot writes, AI-assisted reconstruction, web deep-links, Project CRUD, workspace invites, Pages wiki-sync, self-hosted infra compatibility, PM-issue import, and automated self-hosted provisioning (§2.4). Two separate severe bugs were introduced and then found and fixed by dedicated security review, not by the test suite going green (§6.6) — the second (phase 5a) was a different call-site family of the exact same underlying bug class as the first (phase 4a): widening one function's Plane support and assuming every caller of the functions underneath it had been audited, when it hadn't. The later 2026-08-19 clean self-hosted pass matters because it moved Plane support from code-complete to exercised-through-Apex for the local/self-hosted path: real Plane auth, Project CRUD, Active Context, Phase 1 finalize, Task Board, members, Pages degraded behavior, browser restore, and Phase 6 issue import all passed against a working Plane dashboard.</w:t>
       </w:r>
-      <w:r/>
-      <w:r/>
     </w:p>
     <w:p>
       <w:pPr>
         <w:pStyle w:val="ListBullet"/>
       </w:pPr>
       <w:r>
-        <w:t>Two Plane live-testing tasks remain open, both requiring a real human credential this assistant will not enter itself: a Plane-Cloud members write-path smoke test (invite/role-change/remove), and a self-hosted feature-level UI click-through. The second was attempted directly by this assistant (2026-08-17/18) using scripts/private-plane-cloud.sh: Docker Desktop (a user-level systemd service on this Linux dev machine, not the system docker.service unit one might expect) and the self-hosted stack were both brought up successfully, and a genuine environment issue was found and fixed along the way — the script's own cloudflared tunnel defaults to QUIC/UDP transport, which this sandbox blocks or severely restricts, so the tunnel never registered a connection; forcing --protocol http2 (TCP-based) fixed it immediately, though the script itself doesn't yet expose a flag for that override. Direct, read-only diagnostic API calls against the tunnel with the script's auto-provisioned token confirmed the instance was reachable and correctly authenticated (401 with no token, 200 with it). The actual sign-in step inside Apex's own UI was deliberately not performed — entering a token into a login field is prohibited for this assistant regardless of instruction, even for a disposable local instance it stood up itself — so the click-through's UI-driven verification is still a task for Tomás, now cheaper to run than before since the environment and a ready token are already provisioned.</w:t>
+        <w:t>One Plane live-testing task remains open, because it requires a real Plane Cloud workspace, a real PAT, and real mailbox acceptance: the Cloud invite-email -&gt; accept -&gt; project-add loop. That path is now semi-automated rather than merely manual: scripts/plane-cloud-members-smoke.py creates a temporary Plane Cloud project, drives Plane through Apex's backend proxy, optionally tests an existing workspace member, sends a workspace invite to the configured email (Tomás's test address is tomassantostaborda@gmail.com), pauses for Gmail acceptance, polls until the invitee appears as a workspace member, then tests project add, role change, Owner-not-assignable, remove, and project cleanup. This keeps the only human step honest — accepting the email — while making every API assertion repeatable.</w:t>
       </w:r>
     </w:p>
     <w:p>
@@ -1570,6 +1564,14 @@
       </w:pPr>
       <w:r>
         <w:t>The self-hosted provisioning script's own readiness check silently wasted its entire retry budget on every run (2026-08-11): a bare curl -f against an endpoint that correctly answers 401 when healthy treats that 401 as a failure, so the check burned through 90 retries (~7.5 minutes) before falling through to a second, correct check that actually inspected the status code. Caught by reading the script's own log output after a real run, not by inspection; removing the dead first check cut a real run from ~8 minutes to under 15 seconds when the stack was already up. Separately (2026-08-17/18, this assistant's own live click-through attempt), the same script's auto-launched cloudflared tunnel never registered a connection in this sandbox environment — its default QUIC/UDP transport appears to be blocked or badly throttled here, producing an endless retry loop and a hostname that never resolved. Forcing --protocol http2 (TCP-based) on a manually-started replacement tunnel fixed it on the first attempt; the script does not yet expose a flag for that override, a real, if narrow, gap worth closing if this sandbox's networking restriction turns out to be a recurring condition rather than a one-off.</w:t>
+      </w:r>
+    </w:p>
+    <w:p>
+      <w:pPr>
+        <w:pStyle w:val="ListBullet"/>
+      </w:pPr>
+      <w:r>
+        <w:t>A clean self-hosted Plane pass closed the local testing gap, and the remaining Cloud member loop became a repeatable smoke runner (2026-08-19/20). The self-hosted run used scripts/private-plane-cloud.sh with a Cloudflare HTTP/2 tunnel and Apex's local storage backend, then exercised Plane through Apex rather than directly: auth, Project CRUD, Active Context loads, module-backed epics/stories, Phase 1 finalize, Task Board, member add/role/remove, Pages degraded publish, browser restore, and Phase 6 maintenance import all passed. The only apparent member failure was upstream Plane behavior: DELETE returns 204 but project-members-lite can keep the removed row with is_active=false; Apex's adapter already filters inactive rows, so the UI-facing behavior is correct. The new scripts/plane-cloud-members-smoke.py covers the remaining Plane Cloud member path with a manual Gmail acceptance checkpoint, making invite/accept/re-add/role/remove reproducible without requiring this repo to store credentials or mailbox access.</w:t>
       </w:r>
     </w:p>
     <w:sectPr>

</xml_diff>

<commit_message>
docs(framework): credit the 4 real bugs found before the clean Plane pass
The 2026-08-19 clean self-hosted pass entry (4097225) summarized results
without naming the bugs that had to be found and fixed first that same
day: the httpx.request() extensions crash on every Pages call, a uvicorn
--reload restart-storm when --with-frontend shares the watched tree,
stale project state surviving a project delete, and self-hosted CE
having no Pages endpoint at all. Adding them as their own incident
entries, same style as the existing dated bug writeups in this section.
</commit_message>
<xml_diff>
--- a/docs/framework/Apex-Implementation-Report.docx
+++ b/docs/framework/Apex-Implementation-Report.docx
@@ -1564,6 +1564,38 @@
       </w:pPr>
       <w:r>
         <w:t>The self-hosted provisioning script's own readiness check silently wasted its entire retry budget on every run (2026-08-11): a bare curl -f against an endpoint that correctly answers 401 when healthy treats that 401 as a failure, so the check burned through 90 retries (~7.5 minutes) before falling through to a second, correct check that actually inspected the status code. Caught by reading the script's own log output after a real run, not by inspection; removing the dead first check cut a real run from ~8 minutes to under 15 seconds when the stack was already up. Separately (2026-08-17/18, this assistant's own live click-through attempt), the same script's auto-launched cloudflared tunnel never registered a connection in this sandbox environment — its default QUIC/UDP transport appears to be blocked or badly throttled here, producing an endless retry loop and a hostname that never resolved. Forcing --protocol http2 (TCP-based) on a manually-started replacement tunnel fixed it on the first attempt; the script does not yet expose a flag for that override, a real, if narrow, gap worth closing if this sandbox's networking restriction turns out to be a recurring condition rather than a one-off.</w:t>
+      </w:r>
+    </w:p>
+    <w:p>
+      <w:pPr>
+        <w:pStyle w:val="ListBullet"/>
+      </w:pPr>
+      <w:r>
+        <w:t>The Plane wiki service crashed on every Pages call (2026-08-19): _request() used the module-level httpx.request() shortcut with an extensions kwarg carrying the SSRF DNS-rebinding pin (sni_hostname) — that shortcut function doesn't accept extensions (only Client.request()/.send() do, confirmed against the installed httpx 0.28.1's own signature), so every Pages/wiki-status call raised a bare TypeError, surfaced to the UI as "Failed to read PM Wiki." Found live against a self-hosted instance, not caught by any test (the mocked layer never exercises the real httpx call shape). Fixed by using a short-lived httpx.Client instead of the shortcut, extensions preserved.</w:t>
+      </w:r>
+    </w:p>
+    <w:p>
+      <w:pPr>
+        <w:pStyle w:val="ListBullet"/>
+      </w:pPr>
+      <w:r>
+        <w:t>Running the backend with --with-frontend also running next dev in the same repo caused a permanent uvicorn restart storm (2026-08-19): both self-hosted test scripts ran bare uvicorn --reload, which watches the whole repo root by default, and frontend/.next's webpack cache writes constantly enough to retrigger the reload every ~350ms — the backend never finished booting on one run, and almost certainly explains an earlier session's burst of 403s (requests dropped mid-restart, not a real auth failure). Fixed by scoping both scripts to --reload-dir backend --reload-dir src. The documented plain dev command (CLAUDE.md) shares the same bare --reload and could hit this too if ever run alongside a frontend dev server from the same tree — not yet changed there, since that command doesn't itself invoke a frontend process.</w:t>
+      </w:r>
+    </w:p>
+    <w:p>
+      <w:pPr>
+        <w:pStyle w:val="ListBullet"/>
+      </w:pPr>
+      <w:r>
+        <w:t>Deleting the active Plane project left every panel querying a project that no longer existed (2026-08-19): useDeleteProject's onSuccess only invalidated the project-list query, never the session store's own projectId. The project picker correctly emptied to "Select project," but every consumer of useApiContext() kept firing project-scoped requests against the deleted id, producing a permanent "Loading project context..." spinner and "PM tool denied access" toasts. Fixed with a dedicated clearProject() store action, wired into the delete button's onSuccess alongside its existing toast.</w:t>
+      </w:r>
+    </w:p>
+    <w:p>
+      <w:pPr>
+        <w:pStyle w:val="ListBullet"/>
+      </w:pPr>
+      <w:r>
+        <w:t>Self-hosted Plane Community Edition has no Pages REST endpoint at all (confirmed 2026-08-19 by direct probe: GET .../pages/ 404s while modules/, issues/, and the project-detail endpoint on the identical project all return 200 — ruling out a wrong id or URL). Unlike Epics, which CE still exposes but gates to 404, Pages appears entirely absent from CE's API surface — a genuine, permanent Plane limitation, not an Apex bug. _list_pages now treats that 404 as "no pages" instead of raising, so the sidebar degrades to an empty list instead of a 502 on every project load; publish() still fails loudly if explicitly tried against CE, since no create-fallback exists to degrade to.</w:t>
       </w:r>
     </w:p>
     <w:p>

</xml_diff>